<commit_message>
Basic XML file representation for task 6
</commit_message>
<xml_diff>
--- a/Task4/Отчет Task4.docx
+++ b/Task4/Отчет Task4.docx
@@ -112,32 +112,6 @@
           <w:szCs w:val="24"/>
         </w:rPr>
         <w:t xml:space="preserve">Разработать программу для ввода данных по вашему варианту задания и добавления в таблицу вводимых данных. Опрос пользователей производиться при помощи отдельной вкладки на форме, результаты опроса в виде таблицы должны отображаться на другой вкладке. Для организации вкладок используйте компонент TabControl. Хранение и обработку данных организовать с помощью дополнительных классов. </w:t>
-      </w:r>
-      <w:r>
-        <w:rPr>
-          <w:rFonts w:cs="Times New Roman"/>
-          <w:b/>
-          <w:i/>
-          <w:sz w:val="24"/>
-          <w:szCs w:val="24"/>
-        </w:rPr>
-        <w:t>Задание 2.</w:t>
-      </w:r>
-      <w:r>
-        <w:rPr>
-          <w:rFonts w:ascii="Times New Roman" w:hAnsi="Times New Roman" w:cs="Times New Roman"/>
-          <w:sz w:val="24"/>
-          <w:szCs w:val="24"/>
-        </w:rPr>
-        <w:t xml:space="preserve"> Тестирование подпрограмм с помощью тест-кейсов</w:t>
-      </w:r>
-      <w:r>
-        <w:rPr>
-          <w:rFonts w:ascii="Times New Roman" w:hAnsi="Times New Roman" w:cs="Times New Roman"/>
-          <w:sz w:val="24"/>
-          <w:szCs w:val="24"/>
-        </w:rPr>
-        <w:t>.</w:t>
       </w:r>
     </w:p>
     <w:p>
@@ -393,15 +367,6 @@
           <w:sz w:val="24"/>
         </w:rPr>
         <w:t>Математическая модель</w:t>
-      </w:r>
-      <w:r>
-        <w:rPr>
-          <w:rFonts w:ascii="Times New Roman" w:hAnsi="Times New Roman"/>
-          <w:b/>
-          <w:bCs/>
-          <w:sz w:val="24"/>
-        </w:rPr>
-        <w:t xml:space="preserve"> для проверки существования треугольника</w:t>
       </w:r>
     </w:p>
     <w:p>
@@ -11908,6 +11873,7 @@
           <w:sz w:val="19"/>
           <w:szCs w:val="19"/>
           <w:highlight w:val="white"/>
+          <w:lang w:val="en-US"/>
         </w:rPr>
       </w:pPr>
       <w:r>
@@ -11972,6 +11938,7 @@
           <w:sz w:val="19"/>
           <w:szCs w:val="19"/>
           <w:highlight w:val="white"/>
+          <w:lang w:val="en-US"/>
         </w:rPr>
         <w:t>DialogResult</w:t>
       </w:r>
@@ -11982,6 +11949,7 @@
           <w:sz w:val="19"/>
           <w:szCs w:val="19"/>
           <w:highlight w:val="white"/>
+          <w:lang w:val="en-US"/>
         </w:rPr>
         <w:t xml:space="preserve">.OK) </w:t>
       </w:r>
@@ -11992,6 +11960,7 @@
           <w:sz w:val="19"/>
           <w:szCs w:val="19"/>
           <w:highlight w:val="white"/>
+          <w:lang w:val="en-US"/>
         </w:rPr>
         <w:t>return</w:t>
       </w:r>
@@ -12002,6 +11971,7 @@
           <w:sz w:val="19"/>
           <w:szCs w:val="19"/>
           <w:highlight w:val="white"/>
+          <w:lang w:val="en-US"/>
         </w:rPr>
         <w:t>;</w:t>
       </w:r>
@@ -12018,6 +11988,7 @@
           <w:sz w:val="19"/>
           <w:szCs w:val="19"/>
           <w:highlight w:val="white"/>
+          <w:lang w:val="en-US"/>
         </w:rPr>
       </w:pPr>
     </w:p>
@@ -12043,6 +12014,7 @@
           <w:sz w:val="19"/>
           <w:szCs w:val="19"/>
           <w:highlight w:val="white"/>
+          <w:lang w:val="en-US"/>
         </w:rPr>
         <w:t xml:space="preserve">        </w:t>
       </w:r>
@@ -12891,6 +12863,7 @@
           <w:sz w:val="19"/>
           <w:szCs w:val="19"/>
           <w:highlight w:val="white"/>
+          <w:lang w:val="en-US"/>
         </w:rPr>
       </w:pPr>
       <w:r>
@@ -12955,6 +12928,7 @@
           <w:sz w:val="19"/>
           <w:szCs w:val="19"/>
           <w:highlight w:val="white"/>
+          <w:lang w:val="en-US"/>
         </w:rPr>
         <w:t>DialogResult</w:t>
       </w:r>
@@ -12965,6 +12939,7 @@
           <w:sz w:val="19"/>
           <w:szCs w:val="19"/>
           <w:highlight w:val="white"/>
+          <w:lang w:val="en-US"/>
         </w:rPr>
         <w:t xml:space="preserve">.OK) </w:t>
       </w:r>
@@ -12975,6 +12950,7 @@
           <w:sz w:val="19"/>
           <w:szCs w:val="19"/>
           <w:highlight w:val="white"/>
+          <w:lang w:val="en-US"/>
         </w:rPr>
         <w:t>return</w:t>
       </w:r>
@@ -12985,6 +12961,7 @@
           <w:sz w:val="19"/>
           <w:szCs w:val="19"/>
           <w:highlight w:val="white"/>
+          <w:lang w:val="en-US"/>
         </w:rPr>
         <w:t>;</w:t>
       </w:r>
@@ -13001,6 +12978,7 @@
           <w:sz w:val="19"/>
           <w:szCs w:val="19"/>
           <w:highlight w:val="white"/>
+          <w:lang w:val="en-US"/>
         </w:rPr>
       </w:pPr>
     </w:p>
@@ -13026,6 +13004,7 @@
           <w:sz w:val="19"/>
           <w:szCs w:val="19"/>
           <w:highlight w:val="white"/>
+          <w:lang w:val="en-US"/>
         </w:rPr>
         <w:t xml:space="preserve">        </w:t>
       </w:r>

</xml_diff>